<commit_message>
Add false-mole arrest (Amirul) with Farid's altered extract, and Harun's 2001 suicide verdict
Co-Authored-By: Claude Sonnet 5.5 <noreply@anthropic.com>

Claude-Session: https://claude.ai/code/session_011sBVAmX35tPxqRASXqkfKn
</commit_message>
<xml_diff>
--- a/01_The_Blue_Silence/Manuscript/THE_BLUE_SILENCE_Chapter_25_Aisyah_Investigates_Rahman.docx
+++ b/01_The_Blue_Silence/Manuscript/THE_BLUE_SILENCE_Chapter_25_Aisyah_Investigates_Rahman.docx
@@ -2871,6 +2871,38 @@
       </w:pPr>
       <w:r>
         <w:t>The need to believe his choices had meant something.</w:t>
+      </w:r>
+    </w:p>
+    <w:p>
+      <w:pPr>
+        <w:jc w:val="left"/>
+      </w:pPr>
+      <w:r>
+        <w:t>Harun Ismail’s own record was the thinnest in the cabinet.</w:t>
+      </w:r>
+    </w:p>
+    <w:p>
+      <w:pPr>
+        <w:jc w:val="left"/>
+      </w:pPr>
+      <w:r>
+        <w:t>Died 19 October 2001. Found in his parked car, service pistol beside him. Inquiry finding: suicide. Closed in nine days.</w:t>
+      </w:r>
+    </w:p>
+    <w:p>
+      <w:pPr>
+        <w:jc w:val="left"/>
+      </w:pPr>
+      <w:r>
+        <w:t>A liaison officer from Special Intelligence had attended the inquiry. The name was not recorded.</w:t>
+      </w:r>
+    </w:p>
+    <w:p>
+      <w:pPr>
+        <w:jc w:val="left"/>
+      </w:pPr>
+      <w:r>
+        <w:t>Case 17/94 had been closed the same week, with him.</w:t>
       </w:r>
     </w:p>
     <w:p>

</xml_diff>